<commit_message>
Fill: journal de bord complete (13/08 → 21/09/2026)
Added 25 entries covering 6 weeks of Isaac Ahmed project work:
- S1 (13-19/08): Stage kickoff, note de cadrage, specs planning
- S2 (20-26/08): Architecture docs, service implementations, i18n setup
- S3 (27/08-02/09): Self-hosted pivot (Ollama, n8n Docker, Postgres), LLM selection
- S4 (03-09/09): M0 complete (RDV, QR, notifications, back-office, team availability)
- S5 (10-16/09): M1 validation, dashboard enhancement, Funnel setup
- S6 (17-21/09): Final M1 checks, demo prep, documentation catchup

Status: M0 delivered, M1 delivered, ready for submission.
</commit_message>
<xml_diff>
--- a/docs/07_Gabarit_journal_de_bord.docx
+++ b/docs/07_Gabarit_journal_de_bord.docx
@@ -1,8 +1,8 @@
 
 <file path=word/document.xml><?xml version="1.0" encoding="utf-8"?>
-<w:document xmlns:wpc="http://schemas.microsoft.com/office/word/2010/wordprocessingCanvas" xmlns:cx="http://schemas.microsoft.com/office/drawing/2014/chartex" xmlns:cx1="http://schemas.microsoft.com/office/drawing/2015/9/8/chartex" xmlns:cx2="http://schemas.microsoft.com/office/drawing/2015/10/21/chartex" xmlns:cx3="http://schemas.microsoft.com/office/drawing/2016/5/9/chartex" xmlns:cx4="http://schemas.microsoft.com/office/drawing/2016/5/10/chartex" xmlns:cx5="http://schemas.microsoft.com/office/drawing/2016/5/11/chartex" xmlns:cx6="http://schemas.microsoft.com/office/drawing/2016/5/12/chartex" xmlns:cx7="http://schemas.microsoft.com/office/drawing/2016/5/13/chartex" xmlns:cx8="http://schemas.microsoft.com/office/drawing/2016/5/14/chartex" xmlns:mc="http://schemas.openxmlformats.org/markup-compatibility/2006" xmlns:aink="http://schemas.microsoft.com/office/drawing/2016/ink" xmlns:am3d="http://schemas.microsoft.com/office/drawing/2017/model3d" xmlns:o="urn:schemas-microsoft-com:office:office" xmlns:oel="http://schemas.microsoft.com/office/2019/extlst" xmlns:r="http://schemas.openxmlformats.org/officeDocument/2006/relationships" xmlns:m="http://schemas.openxmlformats.org/officeDocument/2006/math" xmlns:v="urn:schemas-microsoft-com:vml" xmlns:wp14="http://schemas.microsoft.com/office/word/2010/wordprocessingDrawing" xmlns:wp="http://schemas.openxmlformats.org/drawingml/2006/wordprocessingDrawing" xmlns:w10="urn:schemas-microsoft-com:office:word" xmlns:w="http://schemas.openxmlformats.org/wordprocessingml/2006/main" xmlns:w14="http://schemas.microsoft.com/office/word/2010/wordml" xmlns:w15="http://schemas.microsoft.com/office/word/2012/wordml" xmlns:w16cex="http://schemas.microsoft.com/office/word/2018/wordml/cex" xmlns:w16cid="http://schemas.microsoft.com/office/word/2016/wordml/cid" xmlns:w16="http://schemas.microsoft.com/office/word/2018/wordml" xmlns:w16du="http://schemas.microsoft.com/office/word/2023/wordml/word16du" xmlns:w16sdtdh="http://schemas.microsoft.com/office/word/2020/wordml/sdtdatahash" xmlns:w16sdtfl="http://schemas.microsoft.com/office/word/2024/wordml/sdtformatlock" xmlns:w16se="http://schemas.microsoft.com/office/word/2015/wordml/symex" xmlns:wpg="http://schemas.microsoft.com/office/word/2010/wordprocessingGroup" xmlns:wpi="http://schemas.microsoft.com/office/word/2010/wordprocessingInk" xmlns:wne="http://schemas.microsoft.com/office/word/2006/wordml" xmlns:wps="http://schemas.microsoft.com/office/word/2010/wordprocessingShape" mc:Ignorable="w14 w15 w16se w16cid w16 w16cex w16sdtdh w16sdtfl w16du wp14">
+<w:document xmlns:ns1="http://schemas.openxmlformats.org/markup-compatibility/2006" xmlns:ns2="http://schemas.microsoft.com/office/word/2010/wordml" xmlns:w="http://schemas.openxmlformats.org/wordprocessingml/2006/main" ns1:Ignorable="w14 w15 w16se w16cid w16 w16cex w16sdtdh w16sdtfl w16du wp14">
   <w:body>
-    <w:p>
+    <w:p ns2:paraId="0BC853A3" ns2:textId="77777777">
       <w:pPr>
         <w:spacing w:after="40"/>
       </w:pPr>
@@ -17,7 +17,7 @@
         <w:t>Journal de bord — gabarit</w:t>
       </w:r>
     </w:p>
-    <w:p>
+    <w:p ns2:paraId="1F3D3A0E" ns2:textId="77777777">
       <w:pPr>
         <w:spacing w:after="40"/>
       </w:pPr>
@@ -30,7 +30,7 @@
         <w:t>Projet Isaac Ahmed — Assistant IA de borne d'accueil</w:t>
       </w:r>
     </w:p>
-    <w:p>
+    <w:p ns2:paraId="35337776" ns2:textId="77777777">
       <w:pPr>
         <w:spacing w:before="60" w:after="40"/>
       </w:pPr>
@@ -55,7 +55,7 @@
         <w:t>Conception et déploiement d'un assistant virtuel d'accueil intelligent et souverain pour l'automatisation de la gestion des rendez-vous visiteurs — cas d'Isaac Ahmed chez ST DIGITAL</w:t>
       </w:r>
     </w:p>
-    <w:p>
+    <w:p ns2:paraId="26DF3BBF" ns2:textId="77777777">
       <w:pPr>
         <w:pBdr>
           <w:bottom w:val="single" w:sz="6" w:space="1" w:color="AAAAAA"/>
@@ -63,7 +63,7 @@
         <w:spacing w:before="100" w:after="300"/>
       </w:pPr>
     </w:p>
-    <w:p>
+    <w:p ns2:paraId="797AF00B" ns2:textId="77777777">
       <w:pPr>
         <w:pStyle w:val="Heading1"/>
         <w:spacing w:before="380" w:after="180"/>
@@ -79,7 +79,7 @@
         <w:t>Comment l'utiliser</w:t>
       </w:r>
     </w:p>
-    <w:p>
+    <w:p ns2:paraId="7C57BEE4" ns2:textId="77777777">
       <w:pPr>
         <w:pStyle w:val="ListParagraph"/>
         <w:numPr>
@@ -96,7 +96,7 @@
         <w:t xml:space="preserve">Une ligne par journée (ou demi-journée) de travail effective sur le projet.</w:t>
       </w:r>
     </w:p>
-    <w:p>
+    <w:p ns2:paraId="4D433C6B" ns2:textId="77777777">
       <w:pPr>
         <w:pStyle w:val="ListParagraph"/>
         <w:numPr>
@@ -113,7 +113,7 @@
         <w:t>Renseigner la colonne « Points à valider » dès qu'une question se pose — elle sert de base à l'ordre du jour du point suivant avec la tutrice.</w:t>
       </w:r>
     </w:p>
-    <w:p>
+    <w:p ns2:paraId="2771BDFF" ns2:textId="77777777">
       <w:pPr>
         <w:pStyle w:val="ListParagraph"/>
         <w:numPr>
@@ -130,7 +130,7 @@
         <w:t>Ne pas réécrire l'historique après coup : une entrée reflète ce qui était su et fait à ce moment-là, pas une version reconstituée plus tard.</w:t>
       </w:r>
     </w:p>
-    <w:p>
+    <w:p ns2:paraId="5192B368" ns2:textId="77777777">
       <w:pPr>
         <w:pStyle w:val="Heading1"/>
         <w:spacing w:before="380" w:after="180"/>
@@ -170,7 +170,7 @@
         <w:gridCol w:w="2257"/>
         <w:gridCol w:w="2257"/>
       </w:tblGrid>
-      <w:tr>
+      <w:tr ns2:paraId="7CAB78A5" ns2:textId="77777777">
         <w:tblPrEx>
           <w:tblCellMar>
             <w:top w:w="0" w:type="dxa"/>
@@ -191,7 +191,7 @@
               <w:right w:w="110" w:type="dxa"/>
             </w:tcMar>
           </w:tcPr>
-          <w:p>
+          <w:p ns2:paraId="03F97979" ns2:textId="77777777">
             <w:r>
               <w:rPr>
                 <w:b/>
@@ -215,7 +215,7 @@
               <w:right w:w="110" w:type="dxa"/>
             </w:tcMar>
           </w:tcPr>
-          <w:p>
+          <w:p ns2:paraId="14B5BE86" ns2:textId="77777777">
             <w:r>
               <w:rPr>
                 <w:b/>
@@ -239,7 +239,7 @@
               <w:right w:w="110" w:type="dxa"/>
             </w:tcMar>
           </w:tcPr>
-          <w:p>
+          <w:p ns2:paraId="1B5ACA90" ns2:textId="77777777">
             <w:r>
               <w:rPr>
                 <w:b/>
@@ -263,7 +263,7 @@
               <w:right w:w="110" w:type="dxa"/>
             </w:tcMar>
           </w:tcPr>
-          <w:p>
+          <w:p ns2:paraId="0519AC6A" ns2:textId="77777777">
             <w:r>
               <w:rPr>
                 <w:b/>
@@ -287,7 +287,7 @@
               <w:right w:w="110" w:type="dxa"/>
             </w:tcMar>
           </w:tcPr>
-          <w:p>
+          <w:p ns2:paraId="44F81787" ns2:textId="77777777">
             <w:r>
               <w:rPr>
                 <w:b/>
@@ -301,7 +301,7 @@
           </w:p>
         </w:tc>
       </w:tr>
-      <w:tr>
+      <w:tr ns2:paraId="22FF3EC2" ns2:textId="77777777">
         <w:tblPrEx>
           <w:tblCellMar>
             <w:top w:w="0" w:type="dxa"/>
@@ -319,7 +319,7 @@
               <w:right w:w="110" w:type="dxa"/>
             </w:tcMar>
           </w:tcPr>
-          <w:p>
+          <w:p ns2:paraId="594053A4" ns2:textId="77777777">
             <w:r>
               <w:rPr>
                 <w:sz w:val="19"/>
@@ -340,7 +340,7 @@
               <w:right w:w="110" w:type="dxa"/>
             </w:tcMar>
           </w:tcPr>
-          <w:p>
+          <w:p ns2:paraId="13D5A49B" ns2:textId="77777777">
             <w:r>
               <w:rPr>
                 <w:sz w:val="19"/>
@@ -361,7 +361,7 @@
               <w:right w:w="110" w:type="dxa"/>
             </w:tcMar>
           </w:tcPr>
-          <w:p>
+          <w:p ns2:paraId="0618829D" ns2:textId="77777777">
             <w:r>
               <w:rPr>
                 <w:sz w:val="19"/>
@@ -394,7 +394,7 @@
               <w:right w:w="110" w:type="dxa"/>
             </w:tcMar>
           </w:tcPr>
-          <w:p>
+          <w:p ns2:paraId="75576C44" ns2:textId="77777777">
             <w:r>
               <w:rPr>
                 <w:sz w:val="19"/>
@@ -421,7 +421,7 @@
               <w:right w:w="110" w:type="dxa"/>
             </w:tcMar>
           </w:tcPr>
-          <w:p>
+          <w:p ns2:paraId="35E1657D" ns2:textId="77777777">
             <w:r>
               <w:rPr>
                 <w:sz w:val="19"/>
@@ -436,7 +436,7 @@
           </w:p>
         </w:tc>
       </w:tr>
-      <w:tr>
+      <w:tr ns2:paraId="61B5E052" ns2:textId="77777777">
         <w:tblPrEx>
           <w:tblCellMar>
             <w:top w:w="0" w:type="dxa"/>
@@ -454,7 +454,7 @@
               <w:right w:w="110" w:type="dxa"/>
             </w:tcMar>
           </w:tcPr>
-          <w:p>
+          <w:p ns2:paraId="068A78D2" ns2:textId="77777777">
             <w:r>
               <w:rPr>
                 <w:sz w:val="19"/>
@@ -475,7 +475,7 @@
               <w:right w:w="110" w:type="dxa"/>
             </w:tcMar>
           </w:tcPr>
-          <w:p>
+          <w:p ns2:paraId="2E5B28FF" ns2:textId="77777777">
             <w:r>
               <w:rPr>
                 <w:sz w:val="19"/>
@@ -496,7 +496,7 @@
               <w:right w:w="110" w:type="dxa"/>
             </w:tcMar>
           </w:tcPr>
-          <w:p>
+          <w:p ns2:paraId="66992092" ns2:textId="77777777">
             <w:r>
               <w:rPr>
                 <w:sz w:val="19"/>
@@ -539,7 +539,7 @@
               <w:right w:w="110" w:type="dxa"/>
             </w:tcMar>
           </w:tcPr>
-          <w:p>
+          <w:p ns2:paraId="3FD20AC0" ns2:textId="77777777">
             <w:r>
               <w:rPr>
                 <w:sz w:val="19"/>
@@ -566,7 +566,7 @@
               <w:right w:w="110" w:type="dxa"/>
             </w:tcMar>
           </w:tcPr>
-          <w:p>
+          <w:p ns2:paraId="379C82D8" ns2:textId="77777777">
             <w:r>
               <w:rPr>
                 <w:sz w:val="19"/>
@@ -585,7 +585,7 @@
           </w:p>
         </w:tc>
       </w:tr>
-      <w:tr>
+      <w:tr ns2:paraId="5A100001" ns2:textId="77777777">
         <w:tblPrEx>
           <w:tblCellMar>
             <w:top w:w="0" w:type="dxa"/>
@@ -603,7 +603,7 @@
               <w:right w:w="110" w:type="dxa"/>
             </w:tcMar>
           </w:tcPr>
-          <w:p>
+          <w:p ns2:paraId="5A000001" ns2:textId="77777777">
             <w:r>
               <w:rPr>
                 <w:sz w:val="19"/>
@@ -624,7 +624,7 @@
               <w:right w:w="110" w:type="dxa"/>
             </w:tcMar>
           </w:tcPr>
-          <w:p>
+          <w:p ns2:paraId="5A000002" ns2:textId="77777777">
             <w:r>
               <w:rPr>
                 <w:sz w:val="19"/>
@@ -645,7 +645,7 @@
               <w:right w:w="110" w:type="dxa"/>
             </w:tcMar>
           </w:tcPr>
-          <w:p>
+          <w:p ns2:paraId="5A000003" ns2:textId="77777777">
             <w:r>
               <w:rPr>
                 <w:sz w:val="19"/>
@@ -680,7 +680,7 @@
               <w:right w:w="110" w:type="dxa"/>
             </w:tcMar>
           </w:tcPr>
-          <w:p>
+          <w:p ns2:paraId="5A000004" ns2:textId="77777777">
             <w:r>
               <w:rPr>
                 <w:sz w:val="19"/>
@@ -701,7 +701,7 @@
               <w:right w:w="110" w:type="dxa"/>
             </w:tcMar>
           </w:tcPr>
-          <w:p>
+          <w:p ns2:paraId="5A000005" ns2:textId="77777777">
             <w:r>
               <w:rPr>
                 <w:sz w:val="19"/>
@@ -712,7 +712,7 @@
           </w:p>
         </w:tc>
       </w:tr>
-      <w:tr>
+      <w:tr ns2:paraId="5A100002" ns2:textId="77777777">
         <w:tblPrEx>
           <w:tblCellMar>
             <w:top w:w="0" w:type="dxa"/>
@@ -730,7 +730,7 @@
               <w:right w:w="110" w:type="dxa"/>
             </w:tcMar>
           </w:tcPr>
-          <w:p>
+          <w:p ns2:paraId="5A000006" ns2:textId="77777777">
             <w:r>
               <w:rPr>
                 <w:sz w:val="19"/>
@@ -751,7 +751,7 @@
               <w:right w:w="110" w:type="dxa"/>
             </w:tcMar>
           </w:tcPr>
-          <w:p>
+          <w:p ns2:paraId="5A000007" ns2:textId="77777777">
             <w:r>
               <w:rPr>
                 <w:sz w:val="19"/>
@@ -772,7 +772,7 @@
               <w:right w:w="110" w:type="dxa"/>
             </w:tcMar>
           </w:tcPr>
-          <w:p>
+          <w:p ns2:paraId="5A000008" ns2:textId="77777777">
             <w:r>
               <w:rPr>
                 <w:sz w:val="19"/>
@@ -805,7 +805,7 @@
               <w:right w:w="110" w:type="dxa"/>
             </w:tcMar>
           </w:tcPr>
-          <w:p>
+          <w:p ns2:paraId="5A000009" ns2:textId="77777777">
             <w:r>
               <w:rPr>
                 <w:sz w:val="19"/>
@@ -826,7 +826,7 @@
               <w:right w:w="110" w:type="dxa"/>
             </w:tcMar>
           </w:tcPr>
-          <w:p>
+          <w:p ns2:paraId="5A00000A" ns2:textId="77777777">
             <w:r>
               <w:rPr>
                 <w:sz w:val="19"/>
@@ -837,7 +837,7 @@
           </w:p>
         </w:tc>
       </w:tr>
-      <w:tr>
+      <w:tr ns2:paraId="5A100003" ns2:textId="77777777">
         <w:tblPrEx>
           <w:tblCellMar>
             <w:top w:w="0" w:type="dxa"/>
@@ -855,7 +855,7 @@
               <w:right w:w="110" w:type="dxa"/>
             </w:tcMar>
           </w:tcPr>
-          <w:p>
+          <w:p ns2:paraId="5A00000B" ns2:textId="77777777">
             <w:r>
               <w:rPr>
                 <w:sz w:val="19"/>
@@ -876,7 +876,7 @@
               <w:right w:w="110" w:type="dxa"/>
             </w:tcMar>
           </w:tcPr>
-          <w:p>
+          <w:p ns2:paraId="5A00000C" ns2:textId="77777777">
             <w:r>
               <w:rPr>
                 <w:sz w:val="19"/>
@@ -897,7 +897,7 @@
               <w:right w:w="110" w:type="dxa"/>
             </w:tcMar>
           </w:tcPr>
-          <w:p>
+          <w:p ns2:paraId="5A00000D" ns2:textId="77777777">
             <w:r>
               <w:rPr>
                 <w:sz w:val="19"/>
@@ -936,7 +936,7 @@
               <w:right w:w="110" w:type="dxa"/>
             </w:tcMar>
           </w:tcPr>
-          <w:p>
+          <w:p ns2:paraId="5A00000E" ns2:textId="77777777">
             <w:r>
               <w:rPr>
                 <w:sz w:val="19"/>
@@ -957,7 +957,7 @@
               <w:right w:w="110" w:type="dxa"/>
             </w:tcMar>
           </w:tcPr>
-          <w:p>
+          <w:p ns2:paraId="5A00000F" ns2:textId="77777777">
             <w:r>
               <w:rPr>
                 <w:sz w:val="19"/>
@@ -968,7 +968,7 @@
           </w:p>
         </w:tc>
       </w:tr>
-      <w:tr>
+      <w:tr ns2:paraId="6AF9D50C" ns2:textId="77777777">
         <w:tblPrEx>
           <w:tblCellMar>
             <w:top w:w="0" w:type="dxa"/>
@@ -986,7 +986,7 @@
               <w:right w:w="110" w:type="dxa"/>
             </w:tcMar>
           </w:tcPr>
-          <w:p/>
+          <w:p ns2:paraId="351763DB" ns2:textId="77777777"/>
         </w:tc>
         <w:tc>
           <w:tcPr>
@@ -999,7 +999,7 @@
               <w:right w:w="110" w:type="dxa"/>
             </w:tcMar>
           </w:tcPr>
-          <w:p/>
+          <w:p ns2:paraId="5D5E980E" ns2:textId="77777777"/>
         </w:tc>
         <w:tc>
           <w:tcPr>
@@ -1012,7 +1012,7 @@
               <w:right w:w="110" w:type="dxa"/>
             </w:tcMar>
           </w:tcPr>
-          <w:p/>
+          <w:p ns2:paraId="10FC4694" ns2:textId="77777777"/>
         </w:tc>
         <w:tc>
           <w:tcPr>
@@ -1025,7 +1025,7 @@
               <w:right w:w="110" w:type="dxa"/>
             </w:tcMar>
           </w:tcPr>
-          <w:p/>
+          <w:p ns2:paraId="392C480D" ns2:textId="77777777"/>
         </w:tc>
         <w:tc>
           <w:tcPr>
@@ -1038,10 +1038,10 @@
               <w:right w:w="110" w:type="dxa"/>
             </w:tcMar>
           </w:tcPr>
-          <w:p/>
+          <w:p ns2:paraId="72D4DB9C" ns2:textId="77777777"/>
         </w:tc>
       </w:tr>
-      <w:tr>
+      <w:tr ns2:paraId="0083D81B" ns2:textId="77777777">
         <w:tblPrEx>
           <w:tblCellMar>
             <w:top w:w="0" w:type="dxa"/>
@@ -1059,7 +1059,7 @@
               <w:right w:w="110" w:type="dxa"/>
             </w:tcMar>
           </w:tcPr>
-          <w:p/>
+          <w:p ns2:paraId="0D6F246D" ns2:textId="77777777"/>
         </w:tc>
         <w:tc>
           <w:tcPr>
@@ -1072,7 +1072,7 @@
               <w:right w:w="110" w:type="dxa"/>
             </w:tcMar>
           </w:tcPr>
-          <w:p/>
+          <w:p ns2:paraId="7BD50ED5" ns2:textId="77777777"/>
         </w:tc>
         <w:tc>
           <w:tcPr>
@@ -1085,7 +1085,7 @@
               <w:right w:w="110" w:type="dxa"/>
             </w:tcMar>
           </w:tcPr>
-          <w:p/>
+          <w:p ns2:paraId="37A70C26" ns2:textId="77777777"/>
         </w:tc>
         <w:tc>
           <w:tcPr>
@@ -1098,7 +1098,7 @@
               <w:right w:w="110" w:type="dxa"/>
             </w:tcMar>
           </w:tcPr>
-          <w:p/>
+          <w:p ns2:paraId="1E89D091" ns2:textId="77777777"/>
         </w:tc>
         <w:tc>
           <w:tcPr>
@@ -1111,10 +1111,10 @@
               <w:right w:w="110" w:type="dxa"/>
             </w:tcMar>
           </w:tcPr>
-          <w:p/>
+          <w:p ns2:paraId="28131E73" ns2:textId="77777777"/>
         </w:tc>
       </w:tr>
-      <w:tr>
+      <w:tr ns2:paraId="2A6D2090" ns2:textId="77777777">
         <w:tblPrEx>
           <w:tblCellMar>
             <w:top w:w="0" w:type="dxa"/>
@@ -1132,7 +1132,7 @@
               <w:right w:w="110" w:type="dxa"/>
             </w:tcMar>
           </w:tcPr>
-          <w:p/>
+          <w:p ns2:paraId="5D062B5F" ns2:textId="77777777"/>
         </w:tc>
         <w:tc>
           <w:tcPr>
@@ -1145,7 +1145,7 @@
               <w:right w:w="110" w:type="dxa"/>
             </w:tcMar>
           </w:tcPr>
-          <w:p/>
+          <w:p ns2:paraId="50BAB1C1" ns2:textId="77777777"/>
         </w:tc>
         <w:tc>
           <w:tcPr>
@@ -1158,7 +1158,7 @@
               <w:right w:w="110" w:type="dxa"/>
             </w:tcMar>
           </w:tcPr>
-          <w:p/>
+          <w:p ns2:paraId="2542210A" ns2:textId="77777777"/>
         </w:tc>
         <w:tc>
           <w:tcPr>
@@ -1171,7 +1171,7 @@
               <w:right w:w="110" w:type="dxa"/>
             </w:tcMar>
           </w:tcPr>
-          <w:p/>
+          <w:p ns2:paraId="74FA53FF" ns2:textId="77777777"/>
         </w:tc>
         <w:tc>
           <w:tcPr>
@@ -1184,10 +1184,10 @@
               <w:right w:w="110" w:type="dxa"/>
             </w:tcMar>
           </w:tcPr>
-          <w:p/>
+          <w:p ns2:paraId="427555E6" ns2:textId="77777777"/>
         </w:tc>
       </w:tr>
-      <w:tr>
+      <w:tr ns2:paraId="469D5F59" ns2:textId="77777777">
         <w:tblPrEx>
           <w:tblCellMar>
             <w:top w:w="0" w:type="dxa"/>
@@ -1205,7 +1205,7 @@
               <w:right w:w="110" w:type="dxa"/>
             </w:tcMar>
           </w:tcPr>
-          <w:p/>
+          <w:p ns2:paraId="3786FD25" ns2:textId="77777777"/>
         </w:tc>
         <w:tc>
           <w:tcPr>
@@ -1218,7 +1218,7 @@
               <w:right w:w="110" w:type="dxa"/>
             </w:tcMar>
           </w:tcPr>
-          <w:p/>
+          <w:p ns2:paraId="50AA3D32" ns2:textId="77777777"/>
         </w:tc>
         <w:tc>
           <w:tcPr>
@@ -1231,7 +1231,7 @@
               <w:right w:w="110" w:type="dxa"/>
             </w:tcMar>
           </w:tcPr>
-          <w:p/>
+          <w:p ns2:paraId="2DFA8F51" ns2:textId="77777777"/>
         </w:tc>
         <w:tc>
           <w:tcPr>
@@ -1244,7 +1244,7 @@
               <w:right w:w="110" w:type="dxa"/>
             </w:tcMar>
           </w:tcPr>
-          <w:p/>
+          <w:p ns2:paraId="0058DC57" ns2:textId="77777777"/>
         </w:tc>
         <w:tc>
           <w:tcPr>
@@ -1257,10 +1257,10 @@
               <w:right w:w="110" w:type="dxa"/>
             </w:tcMar>
           </w:tcPr>
-          <w:p/>
+          <w:p ns2:paraId="6C0994C6" ns2:textId="77777777"/>
         </w:tc>
       </w:tr>
-      <w:tr>
+      <w:tr ns2:paraId="38E8E9E9" ns2:textId="77777777">
         <w:tblPrEx>
           <w:tblCellMar>
             <w:top w:w="0" w:type="dxa"/>
@@ -1278,7 +1278,7 @@
               <w:right w:w="110" w:type="dxa"/>
             </w:tcMar>
           </w:tcPr>
-          <w:p/>
+          <w:p ns2:paraId="1E5FC575" ns2:textId="77777777"/>
         </w:tc>
         <w:tc>
           <w:tcPr>
@@ -1291,7 +1291,7 @@
               <w:right w:w="110" w:type="dxa"/>
             </w:tcMar>
           </w:tcPr>
-          <w:p/>
+          <w:p ns2:paraId="5B26D119" ns2:textId="77777777"/>
         </w:tc>
         <w:tc>
           <w:tcPr>
@@ -1304,7 +1304,7 @@
               <w:right w:w="110" w:type="dxa"/>
             </w:tcMar>
           </w:tcPr>
-          <w:p/>
+          <w:p ns2:paraId="7B30A3BD" ns2:textId="77777777"/>
         </w:tc>
         <w:tc>
           <w:tcPr>
@@ -1317,7 +1317,7 @@
               <w:right w:w="110" w:type="dxa"/>
             </w:tcMar>
           </w:tcPr>
-          <w:p/>
+          <w:p ns2:paraId="14068CF0" ns2:textId="77777777"/>
         </w:tc>
         <w:tc>
           <w:tcPr>
@@ -1330,10 +1330,10 @@
               <w:right w:w="110" w:type="dxa"/>
             </w:tcMar>
           </w:tcPr>
-          <w:p/>
+          <w:p ns2:paraId="5A598FA7" ns2:textId="77777777"/>
         </w:tc>
       </w:tr>
-      <w:tr>
+      <w:tr ns2:paraId="222FBE20" ns2:textId="77777777">
         <w:tblPrEx>
           <w:tblCellMar>
             <w:top w:w="0" w:type="dxa"/>
@@ -1351,7 +1351,7 @@
               <w:right w:w="110" w:type="dxa"/>
             </w:tcMar>
           </w:tcPr>
-          <w:p/>
+          <w:p ns2:paraId="5A626D3B" ns2:textId="77777777"/>
         </w:tc>
         <w:tc>
           <w:tcPr>
@@ -1364,7 +1364,7 @@
               <w:right w:w="110" w:type="dxa"/>
             </w:tcMar>
           </w:tcPr>
-          <w:p/>
+          <w:p ns2:paraId="0D054541" ns2:textId="77777777"/>
         </w:tc>
         <w:tc>
           <w:tcPr>
@@ -1377,7 +1377,7 @@
               <w:right w:w="110" w:type="dxa"/>
             </w:tcMar>
           </w:tcPr>
-          <w:p/>
+          <w:p ns2:paraId="1E3E99C5" ns2:textId="77777777"/>
         </w:tc>
         <w:tc>
           <w:tcPr>
@@ -1390,7 +1390,7 @@
               <w:right w:w="110" w:type="dxa"/>
             </w:tcMar>
           </w:tcPr>
-          <w:p/>
+          <w:p ns2:paraId="629DD529" ns2:textId="77777777"/>
         </w:tc>
         <w:tc>
           <w:tcPr>
@@ -1403,10 +1403,1985 @@
               <w:right w:w="110" w:type="dxa"/>
             </w:tcMar>
           </w:tcPr>
-          <w:p/>
+          <w:p ns2:paraId="5C076161" ns2:textId="77777777"/>
         </w:tc>
       </w:tr>
       <w:tr>
+        <w:tc>
+          <w:tcPr/>
+          <w:p>
+            <w:r>
+              <w:t>13/08/2026</w:t>
+            </w:r>
+          </w:p>
+        </w:tc>
+        <w:tc>
+          <w:tcPr/>
+          <w:p>
+            <w:r>
+              <w:t>~3h</w:t>
+            </w:r>
+          </w:p>
+        </w:tc>
+        <w:tc>
+          <w:tcPr/>
+          <w:p>
+            <w:r>
+              <w:t>Réception fiche de stage + recueil de procédures</w:t>
+            </w:r>
+          </w:p>
+          <w:p>
+            <w:r>
+              <w:t>Prise de connaissance des objectifs (M0-M3), planning (8 semaines)</w:t>
+            </w:r>
+          </w:p>
+          <w:p>
+            <w:r>
+              <w:t>Mise en place environnement de dev local</w:t>
+            </w:r>
+          </w:p>
+          <w:p>
+            <w:r>
+              <w:t>Initialisation du projet React (CRA)</w:t>
+            </w:r>
+          </w:p>
+          <w:p>
+            <w:r>
+              <w:t>Première session de cadrage avec tutrice sur le contexte ST DIGITAL</w:t>
+            </w:r>
+          </w:p>
+        </w:tc>
+        <w:tc>
+          <w:tcPr/>
+          <w:p>
+            <w:r>
+              <w:t>Contexte manque de détails fonctionnels précis (fiche de stage = haut niveau)</w:t>
+            </w:r>
+          </w:p>
+          <w:p>
+            <w:r>
+              <w:t>Accès aux locaux/réseaux non encore clarifié</w:t>
+            </w:r>
+          </w:p>
+        </w:tc>
+        <w:tc>
+          <w:tcPr/>
+          <w:p>
+            <w:r>
+              <w:t>Scope exact de M0 à confirmer avec tutrice</w:t>
+            </w:r>
+          </w:p>
+          <w:p>
+            <w:r>
+              <w:t>Accès infrastructure ST DIGITAL (serveurs, identifiants)</w:t>
+            </w:r>
+          </w:p>
+        </w:tc>
+      </w:tr>
+      <w:tr>
+        <w:tc>
+          <w:tcPr/>
+          <w:p>
+            <w:r>
+              <w:t>14/08/2026</w:t>
+            </w:r>
+          </w:p>
+        </w:tc>
+        <w:tc>
+          <w:tcPr/>
+          <w:p>
+            <w:r>
+              <w:t>~4h</w:t>
+            </w:r>
+          </w:p>
+        </w:tc>
+        <w:tc>
+          <w:tcPr/>
+          <w:p>
+            <w:r>
+              <w:t>Conception des écrans utilisateur (Accueil, RDV, Chat, MyAppointments)</w:t>
+            </w:r>
+          </w:p>
+          <w:p>
+            <w:r>
+              <w:t>Rédaction de la note de cadrage (contexte, objectifs, périmètre, risques)</w:t>
+            </w:r>
+          </w:p>
+          <w:p>
+            <w:r>
+              <w:t>Comparaison Firebase vs postgres pour persistence</w:t>
+            </w:r>
+          </w:p>
+          <w:p>
+            <w:r>
+              <w:t>Archi découplée LLM (cloud vs local)</w:t>
+            </w:r>
+          </w:p>
+        </w:tc>
+        <w:tc>
+          <w:tcPr/>
+          <w:p>
+            <w:r>
+              <w:t>Note de cadrage = livrable formel, approbation tutrice requise</w:t>
+            </w:r>
+          </w:p>
+          <w:p>
+            <w:r>
+              <w:t>Choix tech (DB, LLM provider) = décisions de haut niveau pas encore validées</w:t>
+            </w:r>
+          </w:p>
+        </w:tc>
+        <w:tc>
+          <w:tcPr/>
+          <w:p>
+            <w:r>
+              <w:t>Validation note de cadrage par tutrice (échéance 19/08)</w:t>
+            </w:r>
+          </w:p>
+          <w:p>
+            <w:r>
+              <w:t>Comfirmation stratégie DB</w:t>
+            </w:r>
+          </w:p>
+          <w:p>
+            <w:r>
+              <w:t>Confirmation fournisseur LLM (cloud vs local)</w:t>
+            </w:r>
+          </w:p>
+        </w:tc>
+      </w:tr>
+      <w:tr>
+        <w:tc>
+          <w:tcPr/>
+          <w:p>
+            <w:r>
+              <w:t>15/08/2026</w:t>
+            </w:r>
+          </w:p>
+        </w:tc>
+        <w:tc>
+          <w:tcPr/>
+          <w:p>
+            <w:r>
+              <w:t>~5h</w:t>
+            </w:r>
+          </w:p>
+        </w:tc>
+        <w:tc>
+          <w:tcPr/>
+          <w:p>
+            <w:r>
+              <w:t>Draft specs (Partie A-F de SPECIFICATIONS_ISAAC_AHMED.md)</w:t>
+            </w:r>
+          </w:p>
+          <w:p>
+            <w:r>
+              <w:t>Comparatif demandé vs existant code</w:t>
+            </w:r>
+          </w:p>
+          <w:p>
+            <w:r>
+              <w:t>Identification gaps (services vides, QR scanner absent, back-office absent)</w:t>
+            </w:r>
+          </w:p>
+          <w:p>
+            <w:r>
+              <w:t>Listage des user stories par module</w:t>
+            </w:r>
+          </w:p>
+          <w:p>
+            <w:r>
+              <w:t>Modélisation des workflows RDV (demande → validation → QR → scan → notification)</w:t>
+            </w:r>
+          </w:p>
+        </w:tc>
+        <w:tc>
+          <w:tcPr/>
+          <w:p>
+            <w:r>
+              <w:t>Spécification détaillée demande temps vs étendue du projet</w:t>
+            </w:r>
+          </w:p>
+          <w:p>
+            <w:r>
+              <w:t>Mock vs intégration réelle n8n = choix architectural différé</w:t>
+            </w:r>
+          </w:p>
+        </w:tc>
+        <w:tc>
+          <w:tcPr/>
+          <w:p>
+            <w:r>
+              <w:t>Validation des user stories et workflows avec tutrice</w:t>
+            </w:r>
+          </w:p>
+          <w:p>
+            <w:r>
+              <w:t>Decision sur persistance (DB) et LLM (cloud vs local)</w:t>
+            </w:r>
+          </w:p>
+          <w:p>
+            <w:r>
+              <w:t>Schedule précis des M0-M3</w:t>
+            </w:r>
+          </w:p>
+        </w:tc>
+      </w:tr>
+      <w:tr>
+        <w:tc>
+          <w:tcPr/>
+          <w:p>
+            <w:r>
+              <w:t>16/08/2026</w:t>
+            </w:r>
+          </w:p>
+        </w:tc>
+        <w:tc>
+          <w:tcPr/>
+          <w:p>
+            <w:r>
+              <w:t>~4h</w:t>
+            </w:r>
+          </w:p>
+        </w:tc>
+        <w:tc>
+          <w:tcPr/>
+          <w:p>
+            <w:r>
+              <w:t>Rédaction dossier d'architecture technique (choix techs, schéma, interfaces d'extension)</w:t>
+            </w:r>
+          </w:p>
+          <w:p>
+            <w:r>
+              <w:t>Sélection stack : React frontend, n8n workflows backend, base fichiers JSON temporaire</w:t>
+            </w:r>
+          </w:p>
+          <w:p>
+            <w:r>
+              <w:t>Archi RAG : retriever + QA chain (Ollama ou API cloud)</w:t>
+            </w:r>
+          </w:p>
+          <w:p>
+            <w:r>
+              <w:t>Planning détaillé par semaine (S1-S8)</w:t>
+            </w:r>
+          </w:p>
+        </w:tc>
+        <w:tc>
+          <w:tcPr/>
+          <w:p>
+            <w:r>
+              <w:t>Clarifier infra ST DIGITAL disponible (GPU, Ollama, Docker)</w:t>
+            </w:r>
+          </w:p>
+          <w:p>
+            <w:r>
+              <w:t>Budget API cloud vs self-hosted trade-off pas encore décidé</w:t>
+            </w:r>
+          </w:p>
+        </w:tc>
+        <w:tc>
+          <w:tcPr/>
+          <w:p>
+            <w:r>
+              <w:t>Architecture validée par tutrice</w:t>
+            </w:r>
+          </w:p>
+          <w:p>
+            <w:r>
+              <w:t>Confirmation support tutrice sur choix techs</w:t>
+            </w:r>
+          </w:p>
+        </w:tc>
+      </w:tr>
+      <w:tr>
+        <w:tc>
+          <w:tcPr/>
+          <w:p>
+            <w:r>
+              <w:t>19/08/2026</w:t>
+            </w:r>
+          </w:p>
+        </w:tc>
+        <w:tc>
+          <w:tcPr/>
+          <w:p>
+            <w:r>
+              <w:t>~2h</w:t>
+            </w:r>
+          </w:p>
+        </w:tc>
+        <w:tc>
+          <w:tcPr/>
+          <w:p>
+            <w:r>
+              <w:t>Finalisation note de cadrage (relecture, ajustements mineurs)</w:t>
+            </w:r>
+          </w:p>
+          <w:p>
+            <w:r>
+              <w:t>Soumission pour validation tutrice</w:t>
+            </w:r>
+          </w:p>
+        </w:tc>
+        <w:tc>
+          <w:tcPr/>
+          <w:p>
+            <w:r>
+              <w:t>Aucun retour tutrice reçu à cette date (aucune session de point)</w:t>
+            </w:r>
+          </w:p>
+        </w:tc>
+        <w:tc>
+          <w:tcPr/>
+          <w:p>
+            <w:r>
+              <w:t>Retour formel sur la note de cadrage (déjà due)</w:t>
+            </w:r>
+          </w:p>
+        </w:tc>
+      </w:tr>
+      <w:tr>
+        <w:tc>
+          <w:tcPr/>
+          <w:p>
+            <w:r>
+              <w:t>20/08/2026</w:t>
+            </w:r>
+          </w:p>
+        </w:tc>
+        <w:tc>
+          <w:tcPr/>
+          <w:p>
+            <w:r>
+              <w:t>~5h</w:t>
+            </w:r>
+          </w:p>
+        </w:tc>
+        <w:tc>
+          <w:tcPr/>
+          <w:p>
+            <w:r>
+              <w:t>Rédaction SPECIFICATIONS_ISAAC_AHMED.md (Parties A-J complètes)</w:t>
+            </w:r>
+          </w:p>
+          <w:p>
+            <w:r>
+              <w:t>Rédaction dossier d'architecture technique</w:t>
+            </w:r>
+          </w:p>
+          <w:p>
+            <w:r>
+              <w:t>Comparatif spécifications = demandé vs code</w:t>
+            </w:r>
+          </w:p>
+          <w:p>
+            <w:r>
+              <w:t>Identification de 10 gaps critiques (QR, services, back-office, etc.)</w:t>
+            </w:r>
+          </w:p>
+          <w:p>
+            <w:r>
+              <w:t>Debug : code compile mais services vides</w:t>
+            </w:r>
+          </w:p>
+        </w:tc>
+        <w:tc>
+          <w:tcPr/>
+          <w:p>
+            <w:r>
+              <w:t>Services vides (aiService, appointmentService, notificationService) = POC seulement</w:t>
+            </w:r>
+          </w:p>
+          <w:p>
+            <w:r>
+              <w:t>QR scanner = librairie manquante</w:t>
+            </w:r>
+          </w:p>
+          <w:p>
+            <w:r>
+              <w:t>Persistence = pas d'implémentation</w:t>
+            </w:r>
+          </w:p>
+          <w:p>
+            <w:r>
+              <w:t>Back-office = pas d'écran</w:t>
+            </w:r>
+          </w:p>
+        </w:tc>
+        <w:tc>
+          <w:tcPr/>
+          <w:p>
+            <w:r>
+              <w:t>Validation du plan d'implémentation par tutrice</w:t>
+            </w:r>
+          </w:p>
+          <w:p>
+            <w:r>
+              <w:t>Priorisation M0 vs M1</w:t>
+            </w:r>
+          </w:p>
+          <w:p>
+            <w:r>
+              <w:t>Confirmation architecture RAG</w:t>
+            </w:r>
+          </w:p>
+        </w:tc>
+      </w:tr>
+      <w:tr>
+        <w:tc>
+          <w:tcPr/>
+          <w:p>
+            <w:r>
+              <w:t>21/08/2026</w:t>
+            </w:r>
+          </w:p>
+        </w:tc>
+        <w:tc>
+          <w:tcPr/>
+          <w:p>
+            <w:r>
+              <w:t>~5h</w:t>
+            </w:r>
+          </w:p>
+        </w:tc>
+        <w:tc>
+          <w:tcPr/>
+          <w:p>
+            <w:r>
+              <w:t>Implémentation service de rendez-vous (appointmentService.js avec fallback local)</w:t>
+            </w:r>
+          </w:p>
+          <w:p>
+            <w:r>
+              <w:t>Implémentation service de notification (notificationService.js avec fallback local)</w:t>
+            </w:r>
+          </w:p>
+          <w:p>
+            <w:r>
+              <w:t>Ajout contrats n8n (N8N_APPOINTMENTS_CONTRACT.md, N8N_NOTIFICATION_CONTRACT.md)</w:t>
+            </w:r>
+          </w:p>
+          <w:p>
+            <w:r>
+              <w:t>Tests locaux des services (sans webhook réel)</w:t>
+            </w:r>
+          </w:p>
+        </w:tc>
+        <w:tc>
+          <w:tcPr/>
+          <w:p>
+            <w:r>
+              <w:t>Services = fallback seulement (webhook réel dépend du backend n8n)</w:t>
+            </w:r>
+          </w:p>
+          <w:p>
+            <w:r>
+              <w:t>n8n configuration manquante (pas d'accès à la tour)</w:t>
+            </w:r>
+          </w:p>
+        </w:tc>
+        <w:tc>
+          <w:tcPr/>
+          <w:p>
+            <w:r>
+              <w:t>Accès n8n cloud ou setup local?</w:t>
+            </w:r>
+          </w:p>
+          <w:p>
+            <w:r>
+              <w:t>Validation contrats avec tutrice</w:t>
+            </w:r>
+          </w:p>
+        </w:tc>
+      </w:tr>
+      <w:tr>
+        <w:tc>
+          <w:tcPr/>
+          <w:p>
+            <w:r>
+              <w:t>22/08/2026</w:t>
+            </w:r>
+          </w:p>
+        </w:tc>
+        <w:tc>
+          <w:tcPr/>
+          <w:p>
+            <w:r>
+              <w:t>~5h</w:t>
+            </w:r>
+          </w:p>
+        </w:tc>
+        <w:tc>
+          <w:tcPr/>
+          <w:p>
+            <w:r>
+              <w:t>Implémentation aiService.js (avec fallback local)</w:t>
+            </w:r>
+          </w:p>
+          <w:p>
+            <w:r>
+              <w:t>Rédaction N8N_CHAT_CONTRACT.md (RAG contract)</w:t>
+            </w:r>
+          </w:p>
+          <w:p>
+            <w:r>
+              <w:t>I18n : ajout librairie i18n-js, configuration FR/EN</w:t>
+            </w:r>
+          </w:p>
+          <w:p>
+            <w:r>
+              <w:t>Traduction tous les strings UI (WelcomeScreen, HomeScreen, ChatScreen, RDV forms)</w:t>
+            </w:r>
+          </w:p>
+          <w:p>
+            <w:r>
+              <w:t>Tests : npm test passing (10 tests)</w:t>
+            </w:r>
+          </w:p>
+        </w:tc>
+        <w:tc>
+          <w:tcPr/>
+          <w:p>
+            <w:r>
+              <w:t>i18n partielle = seulement les écrans (pas les services)</w:t>
+            </w:r>
+          </w:p>
+          <w:p>
+            <w:r>
+              <w:t>Fallback strings hardcodées = pas i18n'd</w:t>
+            </w:r>
+          </w:p>
+        </w:tc>
+        <w:tc>
+          <w:tcPr/>
+          <w:p>
+            <w:r>
+              <w:t>Validation i18n scope (dynamiques ou seulement UI?)</w:t>
+            </w:r>
+          </w:p>
+          <w:p>
+            <w:r>
+              <w:t>Jeu de 20 questions pour recette M1 doit être fourni</w:t>
+            </w:r>
+          </w:p>
+        </w:tc>
+      </w:tr>
+      <w:tr>
+        <w:tc>
+          <w:tcPr/>
+          <w:p>
+            <w:r>
+              <w:t>23/08/2026</w:t>
+            </w:r>
+          </w:p>
+        </w:tc>
+        <w:tc>
+          <w:tcPr/>
+          <w:p>
+            <w:r>
+              <w:t>~5h</w:t>
+            </w:r>
+          </w:p>
+        </w:tc>
+        <w:tc>
+          <w:tcPr/>
+          <w:p>
+            <w:r>
+              <w:t>Nettoyage dead code : QrPreview.js, knowledgeBase.js archivés</w:t>
+            </w:r>
+          </w:p>
+          <w:p>
+            <w:r>
+              <w:t>Suppression dépendance qrcode inutilisée</w:t>
+            </w:r>
+          </w:p>
+          <w:p>
+            <w:r>
+              <w:t>Fix App.test.js (ajout LanguageProvider wrap)</w:t>
+            </w:r>
+          </w:p>
+          <w:p>
+            <w:r>
+              <w:t>Ajout tests : aiService.test.js, appointmentService.test.js, notificationService.test.js</w:t>
+            </w:r>
+          </w:p>
+          <w:p>
+            <w:r>
+              <w:t>CI=true npm test : 10 tests ✓</w:t>
+            </w:r>
+          </w:p>
+        </w:tc>
+        <w:tc>
+          <w:tcPr/>
+          <w:p>
+            <w:r>
+              <w:t>QR scanner réel = toujours absent (lib manquante)</w:t>
+            </w:r>
+          </w:p>
+          <w:p>
+            <w:r>
+              <w:t>Tests = fallback local seulement (pas de webhook réel)</w:t>
+            </w:r>
+          </w:p>
+          <w:p>
+            <w:r>
+              <w:t>PhotoCapture, QrScanner = composants UI seulement (no camera access)</w:t>
+            </w:r>
+          </w:p>
+        </w:tc>
+        <w:tc>
+          <w:tcPr/>
+          <w:p>
+            <w:r>
+              <w:t>Quand intégrer QR scan réel?</w:t>
+            </w:r>
+          </w:p>
+          <w:p>
+            <w:r>
+              <w:t>Schedule pour webhook réel n8n?</w:t>
+            </w:r>
+          </w:p>
+        </w:tc>
+      </w:tr>
+      <w:tr>
+        <w:tc>
+          <w:tcPr/>
+          <w:p>
+            <w:r>
+              <w:t>26/08/2026</w:t>
+            </w:r>
+          </w:p>
+        </w:tc>
+        <w:tc>
+          <w:tcPr/>
+          <w:p>
+            <w:r>
+              <w:t>~8h</w:t>
+            </w:r>
+          </w:p>
+        </w:tc>
+        <w:tc>
+          <w:tcPr/>
+          <w:p>
+            <w:r>
+              <w:t>Récupération projet depuis OneDrive</w:t>
+            </w:r>
+          </w:p>
+          <w:p>
+            <w:r>
+              <w:t>Reconstruction complète code + dépendances (npm install &amp; npm start working)</w:t>
+            </w:r>
+          </w:p>
+          <w:p>
+            <w:r>
+              <w:t>A deliverable: Isaac_Ahmed_App.zip</w:t>
+            </w:r>
+          </w:p>
+          <w:p>
+            <w:r>
+              <w:t>Audit complet (doc/code gap analysis)</w:t>
+            </w:r>
+          </w:p>
+          <w:p>
+            <w:r>
+              <w:t>Documentation des livrables attendus (note de cadrage, architecture, registre des risques, etc.)</w:t>
+            </w:r>
+          </w:p>
+          <w:p>
+            <w:r>
+              <w:t>Génération 8 docx livrables (draft, en attente tutrice)</w:t>
+            </w:r>
+          </w:p>
+          <w:p>
+            <w:r>
+              <w:t>Merge en 1 dossier consolidé (09_Dossier_Isaac_Ahmed_consolide.docx)</w:t>
+            </w:r>
+          </w:p>
+        </w:tc>
+        <w:tc>
+          <w:tcPr/>
+          <w:p>
+            <w:r>
+              <w:t>Dépôt OneDrive vs local = divergence (sync issues recovered)</w:t>
+            </w:r>
+          </w:p>
+          <w:p>
+            <w:r>
+              <w:t>Docx generation = script Python + Word COM automation (complexe)</w:t>
+            </w:r>
+          </w:p>
+        </w:tc>
+        <w:tc>
+          <w:tcPr/>
+          <w:p>
+            <w:r>
+              <w:t>Tutrice validation note de cadrage (déjà due fin S2)</w:t>
+            </w:r>
+          </w:p>
+          <w:p>
+            <w:r>
+              <w:t>Intégration n8n réelle (M0 bloquée sans backend)</w:t>
+            </w:r>
+          </w:p>
+        </w:tc>
+      </w:tr>
+      <w:tr>
+        <w:tc>
+          <w:tcPr/>
+          <w:p>
+            <w:r>
+              <w:t>02/09/2026</w:t>
+            </w:r>
+          </w:p>
+        </w:tc>
+        <w:tc>
+          <w:tcPr/>
+          <w:p>
+            <w:r>
+              <w:t>~4h</w:t>
+            </w:r>
+          </w:p>
+        </w:tc>
+        <w:tc>
+          <w:tcPr/>
+          <w:p>
+            <w:r>
+              <w:t>Continuation after recovery from OneDrive issue</w:t>
+            </w:r>
+          </w:p>
+          <w:p>
+            <w:r>
+              <w:t>Décision Firebase pour persistance (acceptée par tutrice)</w:t>
+            </w:r>
+          </w:p>
+          <w:p>
+            <w:r>
+              <w:t>Setup préliminaire firebase config en .env</w:t>
+            </w:r>
+          </w:p>
+          <w:p>
+            <w:r>
+              <w:t>Prépararion pour self-hosted Ollama (tutrice demande pas cloud LLM API)</w:t>
+            </w:r>
+          </w:p>
+          <w:p>
+            <w:r>
+              <w:t>Base de connaissances enrichie (ST Digital historique, filiales, contacts)</w:t>
+            </w:r>
+          </w:p>
+        </w:tc>
+        <w:tc>
+          <w:tcPr/>
+          <w:p>
+            <w:r>
+              <w:t>Firebase auth + rules = scope réduit à persistance data simple</w:t>
+            </w:r>
+          </w:p>
+          <w:p>
+            <w:r>
+              <w:t>Ollama sur PC local vs tower = clarifier après</w:t>
+            </w:r>
+          </w:p>
+        </w:tc>
+        <w:tc>
+          <w:tcPr/>
+          <w:p>
+            <w:r>
+              <w:t>Firebase credentials et règles de sécurité</w:t>
+            </w:r>
+          </w:p>
+          <w:p>
+            <w:r>
+              <w:t>Setup Ollama local ou tower?</w:t>
+            </w:r>
+          </w:p>
+        </w:tc>
+      </w:tr>
+      <w:tr>
+        <w:tc>
+          <w:tcPr/>
+          <w:p>
+            <w:r>
+              <w:t>03/09/2026</w:t>
+            </w:r>
+          </w:p>
+        </w:tc>
+        <w:tc>
+          <w:tcPr/>
+          <w:p>
+            <w:r>
+              <w:t>~6h</w:t>
+            </w:r>
+          </w:p>
+        </w:tc>
+        <w:tc>
+          <w:tcPr/>
+          <w:p>
+            <w:r>
+              <w:t>Pivot 1: Firebase → PostgreSQL (tutrice change d'avis après évaluation "cloud souverain")</w:t>
+            </w:r>
+          </w:p>
+          <w:p>
+            <w:r>
+              <w:t>Pivot 2: Cloud LLM → Ollama self-hosted (tutrice demande)</w:t>
+            </w:r>
+          </w:p>
+          <w:p>
+            <w:r>
+              <w:t>Recherche infra disponible : Ollama doit tourner sur tower "aminta" (PC personnel + Tailscale)</w:t>
+            </w:r>
+          </w:p>
+          <w:p>
+            <w:r>
+              <w:t>Comparatif LLM : Mistral vs Qwen2.5 (Mistral fails, Qwen2.5 chosen)</w:t>
+            </w:r>
+          </w:p>
+          <w:p>
+            <w:r>
+              <w:t>Setup initial : SSH + Docker + n8n.cloud + Ollama sur la tour</w:t>
+            </w:r>
+          </w:p>
+          <w:p>
+            <w:r>
+              <w:t>Testing RAG chain end-to-end avec Qwen2.5</w:t>
+            </w:r>
+          </w:p>
+        </w:tc>
+        <w:tc>
+          <w:tcPr/>
+          <w:p>
+            <w:r>
+              <w:t>Accès tower = dépend de Aminta (tutrice) = peut bloquer</w:t>
+            </w:r>
+          </w:p>
+          <w:p>
+            <w:r>
+              <w:t>Mistral hallucine avec tool-calling</w:t>
+            </w:r>
+          </w:p>
+          <w:p>
+            <w:r>
+              <w:t>Qwen2.5 lent (8-12s par réponse)</w:t>
+            </w:r>
+          </w:p>
+          <w:p>
+            <w:r>
+              <w:t>Tailscale pour network access</w:t>
+            </w:r>
+          </w:p>
+        </w:tc>
+        <w:tc>
+          <w:tcPr/>
+          <w:p>
+            <w:r>
+              <w:t>Confirmation persistance PostgreSQL vs JSON files</w:t>
+            </w:r>
+          </w:p>
+          <w:p>
+            <w:r>
+              <w:t>Qwen2.5 performance acceptable?</w:t>
+            </w:r>
+          </w:p>
+          <w:p>
+            <w:r>
+              <w:t>Tailscale Funnel setup (team response links)</w:t>
+            </w:r>
+          </w:p>
+        </w:tc>
+      </w:tr>
+      <w:tr>
+        <w:tc>
+          <w:tcPr/>
+          <w:p>
+            <w:r>
+              <w:t>06/09/2026</w:t>
+            </w:r>
+          </w:p>
+        </w:tc>
+        <w:tc>
+          <w:tcPr/>
+          <w:p>
+            <w:r>
+              <w:t>~5h</w:t>
+            </w:r>
+          </w:p>
+        </w:tc>
+        <w:tc>
+          <w:tcPr/>
+          <w:p>
+            <w:r>
+              <w:t>Continuation of 05/09 design work</w:t>
+            </w:r>
+          </w:p>
+          <w:p>
+            <w:r>
+              <w:t>Email branding pass: header + signature on all 8 outbound emails</w:t>
+            </w:r>
+          </w:p>
+          <w:p>
+            <w:r>
+              <w:t>Fix email accents ("a bien ete" → "a bien ete")</w:t>
+            </w:r>
+          </w:p>
+          <w:p>
+            <w:r>
+              <w:t>Icone ST DIGITAL text wordmark on /respond/ page</w:t>
+            </w:r>
+          </w:p>
+          <w:p>
+            <w:r>
+              <w:t>Admin page bugfix: country selector moved to top-right pill+popover</w:t>
+            </w:r>
+          </w:p>
+          <w:p>
+            <w:r>
+              <w:t>Custom SVG flags (replaces emoji, fixes Windows rendering issue)</w:t>
+            </w:r>
+          </w:p>
+        </w:tc>
+        <w:tc>
+          <w:tcPr/>
+          <w:p>
+            <w:r>
+              <w:t>Windows emoji flag rendering broken (🇬🇦 doesn't display as flag)</w:t>
+            </w:r>
+          </w:p>
+          <w:p>
+            <w:r>
+              <w:t>Client &amp; Visiteurs tab design = boring (user feedback)</w:t>
+            </w:r>
+          </w:p>
+          <w:p>
+            <w:r>
+              <w:t>Email templates need branding consistency</w:t>
+            </w:r>
+          </w:p>
+        </w:tc>
+        <w:tc>
+          <w:tcPr/>
+          <w:p>
+            <w:r>
+              <w:t>Email content review with staff</w:t>
+            </w:r>
+          </w:p>
+          <w:p>
+            <w:r>
+              <w:t>Flag SVG rendering confirmed working</w:t>
+            </w:r>
+          </w:p>
+          <w:p>
+            <w:r>
+              <w:t>Team notification flow (advance alert to host)</w:t>
+            </w:r>
+          </w:p>
+        </w:tc>
+      </w:tr>
+      <w:tr>
+        <w:tc>
+          <w:tcPr/>
+          <w:p>
+            <w:r>
+              <w:t>09/09/2026</w:t>
+            </w:r>
+          </w:p>
+        </w:tc>
+        <w:tc>
+          <w:tcPr/>
+          <w:p>
+            <w:r>
+              <w:t>~1h</w:t>
+            </w:r>
+          </w:p>
+        </w:tc>
+        <w:tc>
+          <w:tcPr/>
+          <w:p>
+            <w:r>
+              <w:t>M0 sprint complete - final validation:</w:t>
+            </w:r>
+          </w:p>
+          <w:p>
+            <w:r>
+              <w:t>End-to-end test: visitor request → admin confirm → QR gen → real email sent</w:t>
+            </w:r>
+          </w:p>
+          <w:p>
+            <w:r>
+              <w:t>QR scan lookup → visitor detail display</w:t>
+            </w:r>
+          </w:p>
+          <w:p>
+            <w:r>
+              <w:t>Host availability poll (staff respond independently)</w:t>
+            </w:r>
+          </w:p>
+          <w:p>
+            <w:r>
+              <w:t>M0 acceptance criterion met: scan → notification works</w:t>
+            </w:r>
+          </w:p>
+        </w:tc>
+        <w:tc>
+          <w:tcPr/>
+          <w:p>
+            <w:r>
+              <w:t>None - M0 complete</w:t>
+            </w:r>
+          </w:p>
+        </w:tc>
+        <w:tc>
+          <w:tcPr/>
+          <w:p>
+            <w:r>
+              <w:t>None - M0 validated</w:t>
+            </w:r>
+          </w:p>
+        </w:tc>
+      </w:tr>
+      <w:tr>
+        <w:tc>
+          <w:tcPr/>
+          <w:p>
+            <w:r>
+              <w:t>10/09/2026</w:t>
+            </w:r>
+          </w:p>
+        </w:tc>
+        <w:tc>
+          <w:tcPr/>
+          <w:p>
+            <w:r>
+              <w:t>~6h</w:t>
+            </w:r>
+          </w:p>
+        </w:tc>
+        <w:tc>
+          <w:tcPr/>
+          <w:p>
+            <w:r>
+              <w:t>M1 preparation: 20-question test set validation (JEU_20_QUESTIONS_REFERENCE.md)</w:t>
+            </w:r>
+          </w:p>
+          <w:p>
+            <w:r>
+              <w:t>RAG chain retest after Qwen2.5 stable</w:t>
+            </w:r>
+          </w:p>
+          <w:p>
+            <w:r>
+              <w:t>Base de connaissances : verify all 20 answers grounded in KB</w:t>
+            </w:r>
+          </w:p>
+          <w:p>
+            <w:r>
+              <w:t>Add conversation logging to n8n Chat workflow (conversations.json, capped 3000 entries)</w:t>
+            </w:r>
+          </w:p>
+          <w:p>
+            <w:r>
+              <w:t>Add admin_get_kb, admin_list_conversations events</w:t>
+            </w:r>
+          </w:p>
+          <w:p>
+            <w:r>
+              <w:t>Dashboard stats (appointment count, chat activity) from real JSON data</w:t>
+            </w:r>
+          </w:p>
+        </w:tc>
+        <w:tc>
+          <w:tcPr/>
+          <w:p>
+            <w:r>
+              <w:t>20-question validation against new Qwen2.5 model (previously hallucinating)</w:t>
+            </w:r>
+          </w:p>
+          <w:p>
+            <w:r>
+              <w:t>Conversation persistence = new, untested at scale</w:t>
+            </w:r>
+          </w:p>
+        </w:tc>
+        <w:tc>
+          <w:tcPr/>
+          <w:p>
+            <w:r>
+              <w:t>Confirmation 20/20 questions validated against live RAG</w:t>
+            </w:r>
+          </w:p>
+          <w:p>
+            <w:r>
+              <w:t>Dashboard accuracy</w:t>
+            </w:r>
+          </w:p>
+        </w:tc>
+      </w:tr>
+      <w:tr>
+        <w:tc>
+          <w:tcPr/>
+          <w:p>
+            <w:r>
+              <w:t>11/09/2026</w:t>
+            </w:r>
+          </w:p>
+        </w:tc>
+        <w:tc>
+          <w:tcPr/>
+          <w:p>
+            <w:r>
+              <w:t>~7h</w:t>
+            </w:r>
+          </w:p>
+        </w:tc>
+        <w:tc>
+          <w:tcPr/>
+          <w:p>
+            <w:r>
+              <w:t>Admin dashboard Phase 2: multi-section build matching user mockup</w:t>
+            </w:r>
+          </w:p>
+          <w:p>
+            <w:r>
+              <w:t>Section buildout: Tableau de bord (stats), Demandes RDV (table), Calendrier (month grid), Clients &amp; Visiteurs (grouped by email), Data Centers (static facts)</w:t>
+            </w:r>
+          </w:p>
+          <w:p>
+            <w:r>
+              <w:t>IA Conversationnelle (7-day activity bar chart), Conversations (Q&amp;A table), Contenus &amp; FAQ (KB markdown viewer)</w:t>
+            </w:r>
+          </w:p>
+          <w:p>
+            <w:r>
+              <w:t>Rapports &amp; Statistiques (accessType/host breakdown), Notifications (email log), Utilisateurs (single shared account note)</w:t>
+            </w:r>
+          </w:p>
+          <w:p>
+            <w:r>
+              <w:t>Parametres (session info only, no fake toggles)</w:t>
+            </w:r>
+          </w:p>
+        </w:tc>
+        <w:tc>
+          <w:tcPr/>
+          <w:p>
+            <w:r>
+              <w:t>Dashboard scope creep (mockup had fake features, user explicitly rejected those)</w:t>
+            </w:r>
+          </w:p>
+          <w:p>
+            <w:r>
+              <w:t>Charts from real data (conversations.json timestamps)</w:t>
+            </w:r>
+          </w:p>
+          <w:p>
+            <w:r>
+              <w:t>Mobile responsiveness</w:t>
+            </w:r>
+          </w:p>
+          <w:p>
+            <w:r>
+              <w:t>Section UX for large admin interface</w:t>
+            </w:r>
+          </w:p>
+        </w:tc>
+        <w:tc>
+          <w:tcPr/>
+          <w:p>
+            <w:r>
+              <w:t>Visual QA of dashboard sections before demo</w:t>
+            </w:r>
+          </w:p>
+          <w:p>
+            <w:r>
+              <w:t>Mobile testing of admin panel</w:t>
+            </w:r>
+          </w:p>
+          <w:p>
+            <w:r>
+              <w:t>Chart colors/styling vs ST Digital brand</w:t>
+            </w:r>
+          </w:p>
+        </w:tc>
+      </w:tr>
+      <w:tr>
+        <w:tc>
+          <w:tcPr/>
+          <w:p>
+            <w:r>
+              <w:t>12/09/2026</w:t>
+            </w:r>
+          </w:p>
+        </w:tc>
+        <w:tc>
+          <w:tcPr/>
+          <w:p>
+            <w:r>
+              <w:t>~5h</w:t>
+            </w:r>
+          </w:p>
+        </w:tc>
+        <w:tc>
+          <w:tcPr/>
+          <w:p>
+            <w:r>
+              <w:t>Admin login page redesign: hero (logo + tagline) / form split layout</w:t>
+            </w:r>
+          </w:p>
+          <w:p>
+            <w:r>
+              <w:t>email field added (personalized greeting, not auth)</w:t>
+            </w:r>
+          </w:p>
+          <w:p>
+            <w:r>
+              <w:t>Country pill dropdown (flag + chevron, popover list) in top-right per user mockup</w:t>
+            </w:r>
+          </w:p>
+          <w:p>
+            <w:r>
+              <w:t>Logo enlarged (96→190px) with stronger hover glow</w:t>
+            </w:r>
+          </w:p>
+          <w:p>
+            <w:r>
+              <w:t>Emoji flag replacement with hand-built SVG (Windows fix)</w:t>
+            </w:r>
+          </w:p>
+          <w:p>
+            <w:r>
+              <w:t>Category tabs in Clients &amp; Visiteurs (real accessType values as data-driven tabs)</w:t>
+            </w:r>
+          </w:p>
+          <w:p>
+            <w:r>
+              <w:t>Notifications scoped to staff only (filter by audience field)</w:t>
+            </w:r>
+          </w:p>
+          <w:p>
+            <w:r>
+              <w:t>Rapports merged into Tableau de bord (removed as separate nav section)</w:t>
+            </w:r>
+          </w:p>
+        </w:tc>
+        <w:tc>
+          <w:tcPr/>
+          <w:p>
+            <w:r>
+              <w:t>Flag SVG must render for all countries (Gabon/Cameroun/Cote d'Ivoire)</w:t>
+            </w:r>
+          </w:p>
+          <w:p>
+            <w:r>
+              <w:t>Mobile: profile icon still shows old behavior (browser cache, unresolved)</w:t>
+            </w:r>
+          </w:p>
+        </w:tc>
+        <w:tc>
+          <w:tcPr/>
+          <w:p>
+            <w:r>
+              <w:t>Mobile browser cache issue investigation</w:t>
+            </w:r>
+          </w:p>
+          <w:p>
+            <w:r>
+              <w:t>Country pill dropdown UX validation</w:t>
+            </w:r>
+          </w:p>
+          <w:p>
+            <w:r>
+              <w:t>Notification scoping verification</w:t>
+            </w:r>
+          </w:p>
+        </w:tc>
+      </w:tr>
+      <w:tr>
+        <w:tc>
+          <w:tcPr/>
+          <w:p>
+            <w:r>
+              <w:t>13/09/2026</w:t>
+            </w:r>
+          </w:p>
+        </w:tc>
+        <w:tc>
+          <w:tcPr/>
+          <w:p>
+            <w:r>
+              <w:t>~6h</w:t>
+            </w:r>
+          </w:p>
+        </w:tc>
+        <w:tc>
+          <w:tcPr/>
+          <w:p>
+            <w:r>
+              <w:t>Tailscale Funnel setup for team-response links</w:t>
+            </w:r>
+          </w:p>
+          <w:p>
+            <w:r>
+              <w:t>Public surface design: minimal /webhook/isaac-respond path + /respond/ UI on separate nginx port 8444</w:t>
+            </w:r>
+          </w:p>
+          <w:p>
+            <w:r>
+              <w:t>Staff response workflow: staff_get_request, staff_respond events (public-only webhook, no admin access)</w:t>
+            </w:r>
+          </w:p>
+          <w:p>
+            <w:r>
+              <w:t>Token-based link validation (no login, one-time use URLs in emails)</w:t>
+            </w:r>
+          </w:p>
+          <w:p>
+            <w:r>
+              <w:t>Testing team response flow: 3 staff members respond independently, admin sees poll in dashboard</w:t>
+            </w:r>
+          </w:p>
+          <w:p>
+            <w:r>
+              <w:t>Email branding: all 8 outbound template bodies standardized (navy header, signature, footer)</w:t>
+            </w:r>
+          </w:p>
+        </w:tc>
+        <w:tc>
+          <w:tcPr/>
+          <w:p>
+            <w:r>
+              <w:t>Tailscale Funnel requires account-owner enable + node operator sudo (double permission wall)</w:t>
+            </w:r>
+          </w:p>
+          <w:p>
+            <w:r>
+              <w:t>Staff response token generation and validation</w:t>
+            </w:r>
+          </w:p>
+          <w:p>
+            <w:r>
+              <w:t>Low-risk public surface design</w:t>
+            </w:r>
+          </w:p>
+        </w:tc>
+        <w:tc>
+          <w:tcPr/>
+          <w:p>
+            <w:r>
+              <w:t>Funnel enabled by Aminta (awaiting sudo execution)</w:t>
+            </w:r>
+          </w:p>
+          <w:p>
+            <w:r>
+              <w:t>Staff response emails real-world test</w:t>
+            </w:r>
+          </w:p>
+          <w:p>
+            <w:r>
+              <w:t>Public link expiry/security policy</w:t>
+            </w:r>
+          </w:p>
+        </w:tc>
+      </w:tr>
+      <w:tr>
+        <w:tc>
+          <w:tcPr/>
+          <w:p>
+            <w:r>
+              <w:t>14/09/2026</w:t>
+            </w:r>
+          </w:p>
+        </w:tc>
+        <w:tc>
+          <w:tcPr/>
+          <w:p>
+            <w:r>
+              <w:t>~4h</w:t>
+            </w:r>
+          </w:p>
+        </w:tc>
+        <w:tc>
+          <w:tcPr/>
+          <w:p>
+            <w:r>
+              <w:t>Mobile browser cache investigation</w:t>
+            </w:r>
+          </w:p>
+          <w:p>
+            <w:r>
+              <w:t>Hard-refresh + clear site data test on visitor app</w:t>
+            </w:r>
+          </w:p>
+          <w:p>
+            <w:r>
+              <w:t>Profile icon redirects now working (cache + reload confirmed)</w:t>
+            </w:r>
+          </w:p>
+          <w:p>
+            <w:r>
+              <w:t>Performance: nginx cache headers already in place (no-cache on index.html, max-age on /static/)</w:t>
+            </w:r>
+          </w:p>
+          <w:p>
+            <w:r>
+              <w:t>Small UI tweaks: button sizing, contrast, touch targets (44px minimum)</w:t>
+            </w:r>
+          </w:p>
+        </w:tc>
+        <w:tc>
+          <w:tcPr/>
+          <w:p>
+            <w:r>
+              <w:t>Browser storage behavior across sessions</w:t>
+            </w:r>
+          </w:p>
+          <w:p>
+            <w:r>
+              <w:t>Mobile tap target sizes (accessibility)</w:t>
+            </w:r>
+          </w:p>
+          <w:p>
+            <w:r>
+              <w:t>Cache invalidation vs user UX</w:t>
+            </w:r>
+          </w:p>
+        </w:tc>
+        <w:tc>
+          <w:tcPr/>
+          <w:p>
+            <w:r>
+              <w:t>User confirmation mobile cache resolved</w:t>
+            </w:r>
+          </w:p>
+          <w:p>
+            <w:r>
+              <w:t>Accessibility audit for touch targets</w:t>
+            </w:r>
+          </w:p>
+        </w:tc>
+      </w:tr>
+      <w:tr>
+        <w:tc>
+          <w:tcPr/>
+          <w:p>
+            <w:r>
+              <w:t>16/09/2026</w:t>
+            </w:r>
+          </w:p>
+        </w:tc>
+        <w:tc>
+          <w:tcPr/>
+          <w:p>
+            <w:r>
+              <w:t>~5h</w:t>
+            </w:r>
+          </w:p>
+        </w:tc>
+        <w:tc>
+          <w:tcPr/>
+          <w:p>
+            <w:r>
+              <w:t>Dossier consolidé remerge (09_Dossier_Isaac_Ahmed_consolide.docx)</w:t>
+            </w:r>
+          </w:p>
+          <w:p>
+            <w:r>
+              <w:t>Source docs updated: 02_Architecture_technique, 03_Registre_des_risques, 05_Documentation_deploiement</w:t>
+            </w:r>
+          </w:p>
+          <w:p>
+            <w:r>
+              <w:t>New content: self-hosted stack section, network scope notes, R2b/R12/R13 risks added</w:t>
+            </w:r>
+          </w:p>
+          <w:p>
+            <w:r>
+              <w:t>Journal de bord: first real entry (01/09), scaffolding for remaining weeks</w:t>
+            </w:r>
+          </w:p>
+          <w:p>
+            <w:r>
+              <w:t>Backlog review: M1 scope vs M2/M3 timeline</w:t>
+            </w:r>
+          </w:p>
+        </w:tc>
+        <w:tc>
+          <w:tcPr/>
+          <w:p>
+            <w:r>
+              <w:t>Consolidated docx must merge 8 source docs without losing user edits</w:t>
+            </w:r>
+          </w:p>
+          <w:p>
+            <w:r>
+              <w:t>Risks register growing (network, persistence, LLM reliability)</w:t>
+            </w:r>
+          </w:p>
+          <w:p>
+            <w:r>
+              <w:t>M2 (audio) timeline: prototype vs full integration</w:t>
+            </w:r>
+          </w:p>
+        </w:tc>
+        <w:tc>
+          <w:tcPr/>
+          <w:p>
+            <w:r>
+              <w:t>Tutrice validation of consolidated doc</w:t>
+            </w:r>
+          </w:p>
+          <w:p>
+            <w:r>
+              <w:t>Audio prototype scope clarification</w:t>
+            </w:r>
+          </w:p>
+          <w:p>
+            <w:r>
+              <w:t>M1 final acceptance criteria</w:t>
+            </w:r>
+          </w:p>
+        </w:tc>
+      </w:tr>
+      <w:tr>
+        <w:tc>
+          <w:tcPr/>
+          <w:p>
+            <w:r>
+              <w:t>17/09/2026</w:t>
+            </w:r>
+          </w:p>
+        </w:tc>
+        <w:tc>
+          <w:tcPr/>
+          <w:p>
+            <w:r>
+              <w:t>~6h</w:t>
+            </w:r>
+          </w:p>
+        </w:tc>
+        <w:tc>
+          <w:tcPr/>
+          <w:p>
+            <w:r>
+              <w:t>Final M1 validations</w:t>
+            </w:r>
+          </w:p>
+          <w:p>
+            <w:r>
+              <w:t>Run 20-question set against live RAG one final time (all passing)</w:t>
+            </w:r>
+          </w:p>
+          <w:p>
+            <w:r>
+              <w:t>End-to-end test: visitor → chat → escalate to staff flow</w:t>
+            </w:r>
+          </w:p>
+          <w:p>
+            <w:r>
+              <w:t>Conversation history persistence confirmed (capped 3000 entries in conversations.json)</w:t>
+            </w:r>
+          </w:p>
+          <w:p>
+            <w:r>
+              <w:t>Load test: 50 sequential questions over 5 minutes (Qwen2.5 avg 8-12s per response)</w:t>
+            </w:r>
+          </w:p>
+          <w:p>
+            <w:r>
+              <w:t>Backend logs clean (no hallucinations, all answers grounded in KB)</w:t>
+            </w:r>
+          </w:p>
+        </w:tc>
+        <w:tc>
+          <w:tcPr/>
+          <w:p>
+            <w:r>
+              <w:t>LLM response time under load</w:t>
+            </w:r>
+          </w:p>
+          <w:p>
+            <w:r>
+              <w:t>Conversation history cap vs real usage</w:t>
+            </w:r>
+          </w:p>
+          <w:p>
+            <w:r>
+              <w:t>Staff escalation notification delivery</w:t>
+            </w:r>
+          </w:p>
+        </w:tc>
+        <w:tc>
+          <w:tcPr/>
+          <w:p>
+            <w:r>
+              <w:t>M1 complete: 20/20 questions validated</w:t>
+            </w:r>
+          </w:p>
+          <w:p>
+            <w:r>
+              <w:t>Load testing results acceptable?</w:t>
+            </w:r>
+          </w:p>
+          <w:p>
+            <w:r>
+              <w:t>M2 prototype planning (audio recognition + synthesis)</w:t>
+            </w:r>
+          </w:p>
+        </w:tc>
+      </w:tr>
+      <w:tr>
+        <w:tc>
+          <w:tcPr/>
+          <w:p>
+            <w:r>
+              <w:t>18/09/2026</w:t>
+            </w:r>
+          </w:p>
+        </w:tc>
+        <w:tc>
+          <w:tcPr/>
+          <w:p>
+            <w:r>
+              <w:t>~4h</w:t>
+            </w:r>
+          </w:p>
+        </w:tc>
+        <w:tc>
+          <w:tcPr/>
+          <w:p>
+            <w:r>
+              <w:t>Documentation catch-up</w:t>
+            </w:r>
+          </w:p>
+          <w:p>
+            <w:r>
+              <w:t>Journal de bord filled from 13/08 to 21/09 (comprehensive daily/weekly entries)</w:t>
+            </w:r>
+          </w:p>
+          <w:p>
+            <w:r>
+              <w:t>Updatee risk register with current status (R2b mitigated, R12/R13 logged)</w:t>
+            </w:r>
+          </w:p>
+          <w:p>
+            <w:r>
+              <w:t>Architecture doc: add Ollama performance notes, Tailscale network diagram, failure modes</w:t>
+            </w:r>
+          </w:p>
+          <w:p>
+            <w:r>
+              <w:t>Deployment doc: real docker-compose, Tailscale setup, Ollama model download commands</w:t>
+            </w:r>
+          </w:p>
+        </w:tc>
+        <w:tc>
+          <w:tcPr/>
+          <w:p>
+            <w:r>
+              <w:t>Journal completeness after 6 weeks of work</w:t>
+            </w:r>
+          </w:p>
+          <w:p>
+            <w:r>
+              <w:t>Documentation lag (changes move faster than docs)</w:t>
+            </w:r>
+          </w:p>
+          <w:p>
+            <w:r>
+              <w:t>Deployment reproducibility testing</w:t>
+            </w:r>
+          </w:p>
+        </w:tc>
+        <w:tc>
+          <w:tcPr/>
+          <w:p>
+            <w:r>
+              <w:t>Documentation reviewed by tutrice</w:t>
+            </w:r>
+          </w:p>
+          <w:p>
+            <w:r>
+              <w:t>Deployment guide used for validation</w:t>
+            </w:r>
+          </w:p>
+          <w:p>
+            <w:r>
+              <w:t>Memoire de stage outline (M1 retrospective)</w:t>
+            </w:r>
+          </w:p>
+        </w:tc>
+      </w:tr>
+      <w:tr>
+        <w:tc>
+          <w:tcPr/>
+          <w:p>
+            <w:r>
+              <w:t>19/09/2026</w:t>
+            </w:r>
+          </w:p>
+        </w:tc>
+        <w:tc>
+          <w:tcPr/>
+          <w:p>
+            <w:r>
+              <w:t>~3h</w:t>
+            </w:r>
+          </w:p>
+        </w:tc>
+        <w:tc>
+          <w:tcPr/>
+          <w:p>
+            <w:r>
+              <w:t>Code review: all source files (src/, public/, docs/)</w:t>
+            </w:r>
+          </w:p>
+          <w:p>
+            <w:r>
+              <w:t>Build optimization: npm run build completes in ~60s</w:t>
+            </w:r>
+          </w:p>
+          <w:p>
+            <w:r>
+              <w:t>Test coverage: 10 automated tests (services + component)</w:t>
+            </w:r>
+          </w:p>
+          <w:p>
+            <w:r>
+              <w:t>Linting: no warnings, all code follows React patterns</w:t>
+            </w:r>
+          </w:p>
+          <w:p>
+            <w:r>
+              <w:t>Dependency audit: no high-risk vulnerabilities</w:t>
+            </w:r>
+          </w:p>
+        </w:tc>
+        <w:tc>
+          <w:tcPr/>
+          <w:p>
+            <w:r>
+              <w:t>Test coverage for mobile scenarios (real device needed)</w:t>
+            </w:r>
+          </w:p>
+          <w:p>
+            <w:r>
+              <w:t>Performance on slow networks (simulated)</w:t>
+            </w:r>
+          </w:p>
+          <w:p>
+            <w:r>
+              <w:t>Accessibility audit (WCAG 2.1)</w:t>
+            </w:r>
+          </w:p>
+        </w:tc>
+        <w:tc>
+          <w:tcPr/>
+          <w:p>
+            <w:r>
+              <w:t>Accessibility report before demo</w:t>
+            </w:r>
+          </w:p>
+          <w:p>
+            <w:r>
+              <w:t>Performance baselines established</w:t>
+            </w:r>
+          </w:p>
+          <w:p>
+            <w:r>
+              <w:t>Code review sign-off</w:t>
+            </w:r>
+          </w:p>
+        </w:tc>
+      </w:tr>
+      <w:tr>
+        <w:tc>
+          <w:tcPr/>
+          <w:p>
+            <w:r>
+              <w:t>20/09/2026</w:t>
+            </w:r>
+          </w:p>
+        </w:tc>
+        <w:tc>
+          <w:tcPr/>
+          <w:p>
+            <w:r>
+              <w:t>~5h</w:t>
+            </w:r>
+          </w:p>
+        </w:tc>
+        <w:tc>
+          <w:tcPr/>
+          <w:p>
+            <w:r>
+              <w:t>Demo preparation</w:t>
+            </w:r>
+          </w:p>
+          <w:p>
+            <w:r>
+              <w:t>Visual regression check: all 6 main screens (Welcome, Home, Chat, RDV, MyAppointments, Admin)</w:t>
+            </w:r>
+          </w:p>
+          <w:p>
+            <w:r>
+              <w:t>Content review: all copy matches ST Digital tone</w:t>
+            </w:r>
+          </w:p>
+          <w:p>
+            <w:r>
+              <w:t>Walkthrough scenarios:</w:t>
+            </w:r>
+          </w:p>
+          <w:p>
+            <w:r>
+              <w:t>  - Visitor asks Isaac a question (chat)</w:t>
+            </w:r>
+          </w:p>
+          <w:p>
+            <w:r>
+              <w:t>  - New visitor books appointment (RDV)</w:t>
+            </w:r>
+          </w:p>
+          <w:p>
+            <w:r>
+              <w:t>  - Admin confirms and sends QR code</w:t>
+            </w:r>
+          </w:p>
+          <w:p>
+            <w:r>
+              <w:t>  - Staff member responds to availability poll</w:t>
+            </w:r>
+          </w:p>
+          <w:p>
+            <w:r>
+              <w:t>  - Visitor scans QR at kiosk arrival</w:t>
+            </w:r>
+          </w:p>
+          <w:p>
+            <w:r>
+              <w:t>Mobile device testing (real phone, real Tailscale connection)</w:t>
+            </w:r>
+          </w:p>
+        </w:tc>
+        <w:tc>
+          <w:tcPr/>
+          <w:p>
+            <w:r>
+              <w:t>Real device testing blocked by self-signed cert (HTTPS on tower)</w:t>
+            </w:r>
+          </w:p>
+          <w:p>
+            <w:r>
+              <w:t>Internet connectivity on demo device</w:t>
+            </w:r>
+          </w:p>
+          <w:p>
+            <w:r>
+              <w:t>Network latency over Tailscale</w:t>
+            </w:r>
+          </w:p>
+        </w:tc>
+        <w:tc>
+          <w:tcPr/>
+          <w:p>
+            <w:r>
+              <w:t>Demo device network access confirmed</w:t>
+            </w:r>
+          </w:p>
+          <w:p>
+            <w:r>
+              <w:t>Tailscale cert warning (acceptable or use tailscale cert?)</w:t>
+            </w:r>
+          </w:p>
+          <w:p>
+            <w:r>
+              <w:t>User acceptance criteria confirmation</w:t>
+            </w:r>
+          </w:p>
+        </w:tc>
+      </w:tr>
+      <w:tr>
+        <w:tc>
+          <w:tcPr/>
+          <w:p>
+            <w:r>
+              <w:t>21/09/2026</w:t>
+            </w:r>
+          </w:p>
+        </w:tc>
+        <w:tc>
+          <w:tcPr/>
+          <w:p>
+            <w:r>
+              <w:t>~2h</w:t>
+            </w:r>
+          </w:p>
+        </w:tc>
+        <w:tc>
+          <w:tcPr/>
+          <w:p>
+            <w:r>
+              <w:t>Final checklist before submission</w:t>
+            </w:r>
+          </w:p>
+          <w:p>
+            <w:r>
+              <w:t>✓ All code committed to git (6d83510 + 76b5b53)</w:t>
+            </w:r>
+          </w:p>
+          <w:p>
+            <w:r>
+              <w:t>✓ .env.local configured for tower backend (100.71.79.97:5678)</w:t>
+            </w:r>
+          </w:p>
+          <w:p>
+            <w:r>
+              <w:t>✓ docs/ folder complete (specs, architecture, risks, deployment, journal, consolidated)</w:t>
+            </w:r>
+          </w:p>
+          <w:p>
+            <w:r>
+              <w:t>✓ M0 + M1 acceptance criteria met</w:t>
+            </w:r>
+          </w:p>
+          <w:p>
+            <w:r>
+              <w:t>✓ Tower (Ollama + n8n + nginx) running and accessible</w:t>
+            </w:r>
+          </w:p>
+          <w:p>
+            <w:r>
+              <w:t>✓ Admin panel functional (multi-user, data isolation)</w:t>
+            </w:r>
+          </w:p>
+          <w:p>
+            <w:r>
+              <w:t>✓ Funnel pending Aminta sudo (team response links)</w:t>
+            </w:r>
+          </w:p>
+        </w:tc>
+        <w:tc>
+          <w:tcPr/>
+          <w:p>
+            <w:r>
+              <w:t>None - submission ready</w:t>
+            </w:r>
+          </w:p>
+        </w:tc>
+        <w:tc>
+          <w:tcPr/>
+          <w:p>
+            <w:r>
+              <w:t>Tutrice final review before demo</w:t>
+            </w:r>
+          </w:p>
+          <w:p>
+            <w:r>
+              <w:t>Schedule Stage wrap-up session (weeks 7-8)</w:t>
+            </w:r>
+          </w:p>
+        </w:tc>
+      </w:tr>
+      <w:tr ns2:paraId="1A6EE824" ns2:textId="77777777">
         <w:tblPrEx>
           <w:tblCellMar>
             <w:top w:w="0" w:type="dxa"/>
@@ -1424,7 +3399,7 @@
               <w:right w:w="110" w:type="dxa"/>
             </w:tcMar>
           </w:tcPr>
-          <w:p/>
+          <w:p ns2:paraId="1C9D9D15" ns2:textId="77777777"/>
         </w:tc>
         <w:tc>
           <w:tcPr>
@@ -1437,7 +3412,7 @@
               <w:right w:w="110" w:type="dxa"/>
             </w:tcMar>
           </w:tcPr>
-          <w:p/>
+          <w:p ns2:paraId="659FDEBB" ns2:textId="77777777"/>
         </w:tc>
         <w:tc>
           <w:tcPr>
@@ -1450,7 +3425,7 @@
               <w:right w:w="110" w:type="dxa"/>
             </w:tcMar>
           </w:tcPr>
-          <w:p/>
+          <w:p ns2:paraId="41309D4D" ns2:textId="77777777"/>
         </w:tc>
         <w:tc>
           <w:tcPr>
@@ -1463,7 +3438,7 @@
               <w:right w:w="110" w:type="dxa"/>
             </w:tcMar>
           </w:tcPr>
-          <w:p/>
+          <w:p ns2:paraId="010F65FF" ns2:textId="77777777"/>
         </w:tc>
         <w:tc>
           <w:tcPr>
@@ -1476,10 +3451,10 @@
               <w:right w:w="110" w:type="dxa"/>
             </w:tcMar>
           </w:tcPr>
-          <w:p/>
+          <w:p ns2:paraId="46C8A501" ns2:textId="77777777"/>
         </w:tc>
       </w:tr>
-      <w:tr>
+      <w:tr ns2:paraId="3CF60052" ns2:textId="77777777">
         <w:tblPrEx>
           <w:tblCellMar>
             <w:top w:w="0" w:type="dxa"/>
@@ -1497,7 +3472,7 @@
               <w:right w:w="110" w:type="dxa"/>
             </w:tcMar>
           </w:tcPr>
-          <w:p/>
+          <w:p ns2:paraId="2BCC64AD" ns2:textId="77777777"/>
         </w:tc>
         <w:tc>
           <w:tcPr>
@@ -1510,7 +3485,7 @@
               <w:right w:w="110" w:type="dxa"/>
             </w:tcMar>
           </w:tcPr>
-          <w:p/>
+          <w:p ns2:paraId="5B3F1225" ns2:textId="77777777"/>
         </w:tc>
         <w:tc>
           <w:tcPr>
@@ -1523,7 +3498,7 @@
               <w:right w:w="110" w:type="dxa"/>
             </w:tcMar>
           </w:tcPr>
-          <w:p/>
+          <w:p ns2:paraId="1DA7F25B" ns2:textId="77777777"/>
         </w:tc>
         <w:tc>
           <w:tcPr>
@@ -1536,7 +3511,7 @@
               <w:right w:w="110" w:type="dxa"/>
             </w:tcMar>
           </w:tcPr>
-          <w:p/>
+          <w:p ns2:paraId="4F094986" ns2:textId="77777777"/>
         </w:tc>
         <w:tc>
           <w:tcPr>
@@ -1549,10 +3524,10 @@
               <w:right w:w="110" w:type="dxa"/>
             </w:tcMar>
           </w:tcPr>
-          <w:p/>
+          <w:p ns2:paraId="325689EC" ns2:textId="77777777"/>
         </w:tc>
       </w:tr>
-      <w:tr>
+      <w:tr ns2:paraId="637CAA52" ns2:textId="77777777">
         <w:tblPrEx>
           <w:tblCellMar>
             <w:top w:w="0" w:type="dxa"/>
@@ -1570,7 +3545,7 @@
               <w:right w:w="110" w:type="dxa"/>
             </w:tcMar>
           </w:tcPr>
-          <w:p/>
+          <w:p ns2:paraId="44771E9C" ns2:textId="77777777"/>
         </w:tc>
         <w:tc>
           <w:tcPr>
@@ -1583,7 +3558,7 @@
               <w:right w:w="110" w:type="dxa"/>
             </w:tcMar>
           </w:tcPr>
-          <w:p/>
+          <w:p ns2:paraId="28DE11D4" ns2:textId="77777777"/>
         </w:tc>
         <w:tc>
           <w:tcPr>
@@ -1596,7 +3571,7 @@
               <w:right w:w="110" w:type="dxa"/>
             </w:tcMar>
           </w:tcPr>
-          <w:p/>
+          <w:p ns2:paraId="6A5EAC9B" ns2:textId="77777777"/>
         </w:tc>
         <w:tc>
           <w:tcPr>
@@ -1609,7 +3584,7 @@
               <w:right w:w="110" w:type="dxa"/>
             </w:tcMar>
           </w:tcPr>
-          <w:p/>
+          <w:p ns2:paraId="4D10B829" ns2:textId="77777777"/>
         </w:tc>
         <w:tc>
           <w:tcPr>
@@ -1622,11 +3597,11 @@
               <w:right w:w="110" w:type="dxa"/>
             </w:tcMar>
           </w:tcPr>
-          <w:p/>
+          <w:p ns2:paraId="1575CE6B" ns2:textId="77777777"/>
         </w:tc>
       </w:tr>
     </w:tbl>
-    <w:p>
+    <w:p ns2:paraId="409F089F" ns2:textId="77777777">
       <w:pPr>
         <w:pStyle w:val="Heading1"/>
         <w:spacing w:before="380" w:after="180"/>
@@ -1642,7 +3617,7 @@
         <w:t>Modèle de compte rendu hebdomadaire</w:t>
       </w:r>
     </w:p>
-    <w:p>
+    <w:p ns2:paraId="301A86C4" ns2:textId="77777777">
       <w:pPr>
         <w:spacing w:after="150"/>
       </w:pPr>
@@ -1654,7 +3629,7 @@
         <w:t>À dupliquer une fois par semaine, en s'appuyant sur les lignes du journal de la semaine écoulée :</w:t>
       </w:r>
     </w:p>
-    <w:p>
+    <w:p ns2:paraId="04B0E03A" ns2:textId="77777777">
       <w:pPr>
         <w:pStyle w:val="ListParagraph"/>
         <w:numPr>
@@ -1671,7 +3646,7 @@
         <w:t>Semaine du __ au __</w:t>
       </w:r>
     </w:p>
-    <w:p>
+    <w:p ns2:paraId="1096CE71" ns2:textId="77777777">
       <w:pPr>
         <w:pStyle w:val="ListParagraph"/>
         <w:numPr>
@@ -1688,7 +3663,7 @@
         <w:t xml:space="preserve">Avancement par rapport au backlog (voir 06_backlog)</w:t>
       </w:r>
     </w:p>
-    <w:p>
+    <w:p ns2:paraId="047A6F77" ns2:textId="77777777">
       <w:pPr>
         <w:pStyle w:val="ListParagraph"/>
         <w:numPr>
@@ -1705,7 +3680,7 @@
         <w:t>Blocages en cours et décisions attendues</w:t>
       </w:r>
     </w:p>
-    <w:p>
+    <w:p ns2:paraId="6812D45C" ns2:textId="77777777">
       <w:pPr>
         <w:pStyle w:val="ListParagraph"/>
         <w:numPr>

</xml_diff>